<commit_message>
feat: add fullstack Flutter 3 frontend and Spring Boot 3 Java backend source code
</commit_message>
<xml_diff>
--- a/NguyenHuynhAnhTuan_S26K65CNTT.docx
+++ b/NguyenHuynhAnhTuan_S26K65CNTT.docx
@@ -200,14 +200,28 @@
           <w:p>
             <w:pPr>
               <w:spacing w:after="80"/>
+              <w:rPr>
+                <w:rFonts w:hint="default"/>
+                <w:lang w:val="en-US"/>
+              </w:rPr>
             </w:pPr>
             <w:r>
               <w:rPr>
                 <w:rFonts w:ascii="Times New Roman" w:hAnsi="Times New Roman"/>
                 <w:sz w:val="25"/>
               </w:rPr>
-              <w:t>ThS/TS. ....................................................</w:t>
+              <w:t>T</w:t>
             </w:r>
+            <w:r>
+              <w:rPr>
+                <w:rFonts w:hint="default"/>
+                <w:sz w:val="25"/>
+                <w:lang w:val="en-US"/>
+              </w:rPr>
+              <w:t>hầy Hoàng Văn Qúy</w:t>
+            </w:r>
+            <w:bookmarkStart w:id="0" w:name="_GoBack"/>
+            <w:bookmarkEnd w:id="0"/>
           </w:p>
         </w:tc>
       </w:tr>
@@ -407,8 +421,6 @@
         </w:rPr>
         <w:t>7</w:t>
       </w:r>
-      <w:bookmarkStart w:id="0" w:name="_GoBack"/>
-      <w:bookmarkEnd w:id="0"/>
     </w:p>
     <w:p>
       <w:r>

</xml_diff>